<commit_message>
feat: add Persian layout templates, oracles, and Mermaid runtime guards
Ship three Persian templates alongside purple_book, a 61-fixture matrix
with independent semantic/package oracles, and Mermaid launch/SVG sidecar
checks. Align CI, bootstrap, and docs on Node 22 and chrome-headless-shell.
</commit_message>
<xml_diff>
--- a/examples/english_technical_doc.docx
+++ b/examples/english_technical_doc.docx
@@ -7,12 +7,16 @@
         <w:tblW w:type="dxa" w:w="9638"/>
         <w:tblLayout w:type="fixed"/>
         <w:tblLook w:firstColumn="1" w:firstRow="1" w:lastColumn="0" w:lastRow="0" w:noHBand="0" w:noVBand="1" w:val="04A0"/>
+        <w:tblDescription w:val="heading_badge"/>
       </w:tblPr>
       <w:tblGrid>
         <w:gridCol w:w="1200"/>
         <w:gridCol w:w="8438"/>
       </w:tblGrid>
       <w:tr>
+        <w:trPr>
+          <w:cantSplit/>
+        </w:trPr>
         <w:tc>
           <w:tcPr>
             <w:tcW w:type="dxa" w:w="1200"/>
@@ -70,10 +74,12 @@
           <w:p>
             <w:pPr>
               <w:bidi w:val="0"/>
-              <w:jc w:val="start"/>
+              <w:jc w:val="left"/>
               <w:keepNext/>
               <w:keepLines/>
+              <w:outlineLvl w:val="0"/>
             </w:pPr>
+            <w:bookmarkStart w:id="1" w:name="distributed_cache_and_persisten_7252c857"/>
             <w:r>
               <w:rPr>
                 <w:rFonts w:ascii="Segoe UI" w:hAnsi="Segoe UI" w:cs="Vazirmatn"/>
@@ -85,8 +91,109 @@
                 <w:lang w:val="en-US" w:bidi="fa-IR"/>
                 <w:rtl w:val="0"/>
               </w:rPr>
-              <w:t>Distributed Cache and Persistence Architecture</w:t>
-            </w:r>
+              <w:t>Distributed</w:t>
+            </w:r>
+            <w:r>
+              <w:rPr>
+                <w:rFonts w:ascii="Vazirmatn" w:hAnsi="Vazirmatn" w:cs="Vazirmatn"/>
+                <w:sz w:val="32"/>
+                <w:szCs w:val="32"/>
+                <w:b/>
+                <w:bCs/>
+                <w:color w:val="2D2D2D"/>
+                <w:lang w:val="en-US" w:bidi="fa-IR"/>
+              </w:rPr>
+              <w:t xml:space="preserve"> </w:t>
+            </w:r>
+            <w:r>
+              <w:rPr>
+                <w:rFonts w:ascii="Segoe UI" w:hAnsi="Segoe UI" w:cs="Vazirmatn"/>
+                <w:sz w:val="32"/>
+                <w:szCs w:val="32"/>
+                <w:b/>
+                <w:bCs/>
+                <w:color w:val="2D2D2D"/>
+                <w:lang w:val="en-US" w:bidi="fa-IR"/>
+                <w:rtl w:val="0"/>
+              </w:rPr>
+              <w:t>Cache</w:t>
+            </w:r>
+            <w:r>
+              <w:rPr>
+                <w:rFonts w:ascii="Vazirmatn" w:hAnsi="Vazirmatn" w:cs="Vazirmatn"/>
+                <w:sz w:val="32"/>
+                <w:szCs w:val="32"/>
+                <w:b/>
+                <w:bCs/>
+                <w:color w:val="2D2D2D"/>
+                <w:lang w:val="en-US" w:bidi="fa-IR"/>
+              </w:rPr>
+              <w:t xml:space="preserve"> </w:t>
+            </w:r>
+            <w:r>
+              <w:rPr>
+                <w:rFonts w:ascii="Segoe UI" w:hAnsi="Segoe UI" w:cs="Vazirmatn"/>
+                <w:sz w:val="32"/>
+                <w:szCs w:val="32"/>
+                <w:b/>
+                <w:bCs/>
+                <w:color w:val="2D2D2D"/>
+                <w:lang w:val="en-US" w:bidi="fa-IR"/>
+                <w:rtl w:val="0"/>
+              </w:rPr>
+              <w:t>and</w:t>
+            </w:r>
+            <w:r>
+              <w:rPr>
+                <w:rFonts w:ascii="Vazirmatn" w:hAnsi="Vazirmatn" w:cs="Vazirmatn"/>
+                <w:sz w:val="32"/>
+                <w:szCs w:val="32"/>
+                <w:b/>
+                <w:bCs/>
+                <w:color w:val="2D2D2D"/>
+                <w:lang w:val="en-US" w:bidi="fa-IR"/>
+              </w:rPr>
+              <w:t xml:space="preserve"> </w:t>
+            </w:r>
+            <w:r>
+              <w:rPr>
+                <w:rFonts w:ascii="Segoe UI" w:hAnsi="Segoe UI" w:cs="Vazirmatn"/>
+                <w:sz w:val="32"/>
+                <w:szCs w:val="32"/>
+                <w:b/>
+                <w:bCs/>
+                <w:color w:val="2D2D2D"/>
+                <w:lang w:val="en-US" w:bidi="fa-IR"/>
+                <w:rtl w:val="0"/>
+              </w:rPr>
+              <w:t>Persistence</w:t>
+            </w:r>
+            <w:r>
+              <w:rPr>
+                <w:rFonts w:ascii="Vazirmatn" w:hAnsi="Vazirmatn" w:cs="Vazirmatn"/>
+                <w:sz w:val="32"/>
+                <w:szCs w:val="32"/>
+                <w:b/>
+                <w:bCs/>
+                <w:color w:val="2D2D2D"/>
+                <w:lang w:val="en-US" w:bidi="fa-IR"/>
+              </w:rPr>
+              <w:t xml:space="preserve"> </w:t>
+            </w:r>
+            <w:r>
+              <w:rPr>
+                <w:rFonts w:ascii="Segoe UI" w:hAnsi="Segoe UI" w:cs="Vazirmatn"/>
+                <w:sz w:val="32"/>
+                <w:szCs w:val="32"/>
+                <w:b/>
+                <w:bCs/>
+                <w:color w:val="2D2D2D"/>
+                <w:lang w:val="en-US" w:bidi="fa-IR"/>
+                <w:rtl w:val="0"/>
+              </w:rPr>
+              <w:t>Architecture</w:t>
+            </w:r>
+            <w:bookmarkEnd w:id="1"/>
           </w:p>
         </w:tc>
       </w:tr>
@@ -520,12 +627,16 @@
         <w:tblW w:type="dxa" w:w="9638"/>
         <w:tblLayout w:type="fixed"/>
         <w:tblLook w:firstColumn="1" w:firstRow="1" w:lastColumn="0" w:lastRow="0" w:noHBand="0" w:noVBand="1" w:val="04A0"/>
+        <w:tblDescription w:val="heading_badge"/>
       </w:tblPr>
       <w:tblGrid>
         <w:gridCol w:w="1200"/>
         <w:gridCol w:w="8438"/>
       </w:tblGrid>
       <w:tr>
+        <w:trPr>
+          <w:cantSplit/>
+        </w:trPr>
         <w:tc>
           <w:tcPr>
             <w:tcW w:type="dxa" w:w="1200"/>
@@ -583,10 +694,12 @@
           <w:p>
             <w:pPr>
               <w:bidi w:val="0"/>
-              <w:jc w:val="start"/>
+              <w:jc w:val="left"/>
               <w:keepNext/>
               <w:keepLines/>
+              <w:outlineLvl w:val="1"/>
             </w:pPr>
+            <w:bookmarkStart w:id="2" w:name="cache_aside_pattern_and_invalid_60952a18"/>
             <w:r>
               <w:rPr>
                 <w:rFonts w:ascii="Segoe UI" w:hAnsi="Segoe UI" w:cs="Vazirmatn"/>
@@ -598,8 +711,84 @@
                 <w:lang w:val="en-US" w:bidi="fa-IR"/>
                 <w:rtl w:val="0"/>
               </w:rPr>
-              <w:t>Cache-Aside Pattern and Invalidation</w:t>
-            </w:r>
+              <w:t>Cache-Aside</w:t>
+            </w:r>
+            <w:r>
+              <w:rPr>
+                <w:rFonts w:ascii="Vazirmatn" w:hAnsi="Vazirmatn" w:cs="Vazirmatn"/>
+                <w:sz w:val="28"/>
+                <w:szCs w:val="28"/>
+                <w:b/>
+                <w:bCs/>
+                <w:color w:val="2D2D2D"/>
+                <w:lang w:val="en-US" w:bidi="fa-IR"/>
+              </w:rPr>
+              <w:t xml:space="preserve"> </w:t>
+            </w:r>
+            <w:r>
+              <w:rPr>
+                <w:rFonts w:ascii="Segoe UI" w:hAnsi="Segoe UI" w:cs="Vazirmatn"/>
+                <w:sz w:val="28"/>
+                <w:szCs w:val="28"/>
+                <w:b/>
+                <w:bCs/>
+                <w:color w:val="2D2D2D"/>
+                <w:lang w:val="en-US" w:bidi="fa-IR"/>
+                <w:rtl w:val="0"/>
+              </w:rPr>
+              <w:t>Pattern</w:t>
+            </w:r>
+            <w:r>
+              <w:rPr>
+                <w:rFonts w:ascii="Vazirmatn" w:hAnsi="Vazirmatn" w:cs="Vazirmatn"/>
+                <w:sz w:val="28"/>
+                <w:szCs w:val="28"/>
+                <w:b/>
+                <w:bCs/>
+                <w:color w:val="2D2D2D"/>
+                <w:lang w:val="en-US" w:bidi="fa-IR"/>
+              </w:rPr>
+              <w:t xml:space="preserve"> </w:t>
+            </w:r>
+            <w:r>
+              <w:rPr>
+                <w:rFonts w:ascii="Segoe UI" w:hAnsi="Segoe UI" w:cs="Vazirmatn"/>
+                <w:sz w:val="28"/>
+                <w:szCs w:val="28"/>
+                <w:b/>
+                <w:bCs/>
+                <w:color w:val="2D2D2D"/>
+                <w:lang w:val="en-US" w:bidi="fa-IR"/>
+                <w:rtl w:val="0"/>
+              </w:rPr>
+              <w:t>and</w:t>
+            </w:r>
+            <w:r>
+              <w:rPr>
+                <w:rFonts w:ascii="Vazirmatn" w:hAnsi="Vazirmatn" w:cs="Vazirmatn"/>
+                <w:sz w:val="28"/>
+                <w:szCs w:val="28"/>
+                <w:b/>
+                <w:bCs/>
+                <w:color w:val="2D2D2D"/>
+                <w:lang w:val="en-US" w:bidi="fa-IR"/>
+              </w:rPr>
+              <w:t xml:space="preserve"> </w:t>
+            </w:r>
+            <w:r>
+              <w:rPr>
+                <w:rFonts w:ascii="Segoe UI" w:hAnsi="Segoe UI" w:cs="Vazirmatn"/>
+                <w:sz w:val="28"/>
+                <w:szCs w:val="28"/>
+                <w:b/>
+                <w:bCs/>
+                <w:color w:val="2D2D2D"/>
+                <w:lang w:val="en-US" w:bidi="fa-IR"/>
+                <w:rtl w:val="0"/>
+              </w:rPr>
+              <w:t>Invalidation</w:t>
+            </w:r>
+            <w:bookmarkEnd w:id="2"/>
           </w:p>
         </w:tc>
       </w:tr>
@@ -1051,14 +1240,18 @@
     </w:p>
     <w:tbl>
       <w:tblPr>
-        <w:tblW w:type="auto" w:w="0"/>
+        <w:tblW w:type="dxa" w:w="9638"/>
         <w:tblLayout w:type="fixed"/>
         <w:tblLook w:firstColumn="1" w:firstRow="1" w:lastColumn="0" w:lastRow="0" w:noHBand="0" w:noVBand="1" w:val="04A0"/>
+        <w:tblDescription w:val="callout"/>
       </w:tblPr>
       <w:tblGrid>
         <w:gridCol w:w="9638"/>
       </w:tblGrid>
       <w:tr>
+        <w:trPr>
+          <w:cantSplit/>
+        </w:trPr>
         <w:tc>
           <w:tcPr>
             <w:tcW w:type="dxa" w:w="9638"/>
@@ -1079,7 +1272,9 @@
           <w:p>
             <w:pPr>
               <w:bidi w:val="0"/>
-              <w:jc w:val="start"/>
+              <w:jc w:val="left"/>
+              <w:keepNext/>
+              <w:keepLines/>
             </w:pPr>
             <w:r>
               <w:rPr>
@@ -1628,14 +1823,18 @@
     </w:p>
     <w:tbl>
       <w:tblPr>
-        <w:tblW w:type="auto" w:w="0"/>
+        <w:tblW w:type="dxa" w:w="9638"/>
         <w:tblLayout w:type="fixed"/>
         <w:tblLook w:firstColumn="1" w:firstRow="1" w:lastColumn="0" w:lastRow="0" w:noHBand="0" w:noVBand="1" w:val="04A0"/>
+        <w:tblDescription w:val="callout"/>
       </w:tblPr>
       <w:tblGrid>
         <w:gridCol w:w="9638"/>
       </w:tblGrid>
       <w:tr>
+        <w:trPr>
+          <w:cantSplit/>
+        </w:trPr>
         <w:tc>
           <w:tcPr>
             <w:tcW w:type="dxa" w:w="9638"/>
@@ -1656,7 +1855,9 @@
           <w:p>
             <w:pPr>
               <w:bidi w:val="0"/>
-              <w:jc w:val="start"/>
+              <w:jc w:val="left"/>
+              <w:keepNext/>
+              <w:keepLines/>
             </w:pPr>
             <w:r>
               <w:rPr>
@@ -2086,8 +2287,8 @@
       <w:r>
         <w:drawing>
           <wp:inline xmlns:a="http://schemas.openxmlformats.org/drawingml/2006/main" xmlns:pic="http://schemas.openxmlformats.org/drawingml/2006/picture">
-            <wp:extent cx="5760720" cy="4239713"/>
-            <wp:docPr id="1" name="Picture 1"/>
+            <wp:extent cx="5760720" cy="4129495"/>
+            <wp:docPr id="1" name="Mermaid Diagram" descr="mermaid"/>
             <wp:cNvGraphicFramePr>
               <a:graphicFrameLocks noChangeAspect="1"/>
             </wp:cNvGraphicFramePr>
@@ -2107,7 +2308,7 @@
                   <pic:spPr>
                     <a:xfrm>
                       <a:off x="0" y="0"/>
-                      <a:ext cx="5760720" cy="4239713"/>
+                      <a:ext cx="5760720" cy="4129495"/>
                     </a:xfrm>
                     <a:prstGeom prst="rect"/>
                   </pic:spPr>
@@ -2505,6 +2706,7 @@
         <w:tblW w:type="dxa" w:w="9638"/>
         <w:tblLayout w:type="fixed"/>
         <w:tblLook w:firstColumn="1" w:firstRow="1" w:lastColumn="0" w:lastRow="0" w:noHBand="0" w:noVBand="1" w:val="04A0"/>
+        <w:tblDescription w:val="code_block"/>
         <w:jc w:val="center"/>
       </w:tblPr>
       <w:tblGrid>
@@ -4362,12 +4564,16 @@
         <w:tblW w:type="dxa" w:w="9638"/>
         <w:tblLayout w:type="fixed"/>
         <w:tblLook w:firstColumn="1" w:firstRow="1" w:lastColumn="0" w:lastRow="0" w:noHBand="0" w:noVBand="1" w:val="04A0"/>
+        <w:tblDescription w:val="heading_badge"/>
       </w:tblPr>
       <w:tblGrid>
         <w:gridCol w:w="1200"/>
         <w:gridCol w:w="8438"/>
       </w:tblGrid>
       <w:tr>
+        <w:trPr>
+          <w:cantSplit/>
+        </w:trPr>
         <w:tc>
           <w:tcPr>
             <w:tcW w:type="dxa" w:w="1200"/>
@@ -4425,10 +4631,12 @@
           <w:p>
             <w:pPr>
               <w:bidi w:val="0"/>
-              <w:jc w:val="start"/>
+              <w:jc w:val="left"/>
               <w:keepNext/>
               <w:keepLines/>
+              <w:outlineLvl w:val="1"/>
             </w:pPr>
+            <w:bookmarkStart w:id="3" w:name="data_access_implementation_f9997d90"/>
             <w:r>
               <w:rPr>
                 <w:rFonts w:ascii="Segoe UI" w:hAnsi="Segoe UI" w:cs="Vazirmatn"/>
@@ -4440,8 +4648,59 @@
                 <w:lang w:val="en-US" w:bidi="fa-IR"/>
                 <w:rtl w:val="0"/>
               </w:rPr>
-              <w:t>Data Access Implementation</w:t>
-            </w:r>
+              <w:t>Data</w:t>
+            </w:r>
+            <w:r>
+              <w:rPr>
+                <w:rFonts w:ascii="Vazirmatn" w:hAnsi="Vazirmatn" w:cs="Vazirmatn"/>
+                <w:sz w:val="28"/>
+                <w:szCs w:val="28"/>
+                <w:b/>
+                <w:bCs/>
+                <w:color w:val="2D2D2D"/>
+                <w:lang w:val="en-US" w:bidi="fa-IR"/>
+              </w:rPr>
+              <w:t xml:space="preserve"> </w:t>
+            </w:r>
+            <w:r>
+              <w:rPr>
+                <w:rFonts w:ascii="Segoe UI" w:hAnsi="Segoe UI" w:cs="Vazirmatn"/>
+                <w:sz w:val="28"/>
+                <w:szCs w:val="28"/>
+                <w:b/>
+                <w:bCs/>
+                <w:color w:val="2D2D2D"/>
+                <w:lang w:val="en-US" w:bidi="fa-IR"/>
+                <w:rtl w:val="0"/>
+              </w:rPr>
+              <w:t>Access</w:t>
+            </w:r>
+            <w:r>
+              <w:rPr>
+                <w:rFonts w:ascii="Vazirmatn" w:hAnsi="Vazirmatn" w:cs="Vazirmatn"/>
+                <w:sz w:val="28"/>
+                <w:szCs w:val="28"/>
+                <w:b/>
+                <w:bCs/>
+                <w:color w:val="2D2D2D"/>
+                <w:lang w:val="en-US" w:bidi="fa-IR"/>
+              </w:rPr>
+              <w:t xml:space="preserve"> </w:t>
+            </w:r>
+            <w:r>
+              <w:rPr>
+                <w:rFonts w:ascii="Segoe UI" w:hAnsi="Segoe UI" w:cs="Vazirmatn"/>
+                <w:sz w:val="28"/>
+                <w:szCs w:val="28"/>
+                <w:b/>
+                <w:bCs/>
+                <w:color w:val="2D2D2D"/>
+                <w:lang w:val="en-US" w:bidi="fa-IR"/>
+                <w:rtl w:val="0"/>
+              </w:rPr>
+              <w:t>Implementation</w:t>
+            </w:r>
+            <w:bookmarkEnd w:id="3"/>
           </w:p>
         </w:tc>
       </w:tr>
@@ -4801,6 +5060,7 @@
         <w:tblW w:type="dxa" w:w="9638"/>
         <w:tblLayout w:type="fixed"/>
         <w:tblLook w:firstColumn="1" w:firstRow="1" w:lastColumn="0" w:lastRow="0" w:noHBand="0" w:noVBand="1" w:val="04A0"/>
+        <w:tblDescription w:val="code_block"/>
         <w:jc w:val="center"/>
       </w:tblPr>
       <w:tblGrid>
@@ -6760,6 +7020,7 @@
         <w:tblW w:type="dxa" w:w="9638"/>
         <w:tblLayout w:type="fixed"/>
         <w:tblLook w:firstColumn="1" w:firstRow="1" w:lastColumn="0" w:lastRow="0" w:noHBand="0" w:noVBand="1" w:val="04A0"/>
+        <w:tblDescription w:val="code_block"/>
         <w:jc w:val="center"/>
       </w:tblPr>
       <w:tblGrid>
@@ -8366,12 +8627,16 @@
         <w:tblW w:type="dxa" w:w="9638"/>
         <w:tblLayout w:type="fixed"/>
         <w:tblLook w:firstColumn="1" w:firstRow="1" w:lastColumn="0" w:lastRow="0" w:noHBand="0" w:noVBand="1" w:val="04A0"/>
+        <w:tblDescription w:val="heading_badge"/>
       </w:tblPr>
       <w:tblGrid>
         <w:gridCol w:w="1200"/>
         <w:gridCol w:w="8438"/>
       </w:tblGrid>
       <w:tr>
+        <w:trPr>
+          <w:cantSplit/>
+        </w:trPr>
         <w:tc>
           <w:tcPr>
             <w:tcW w:type="dxa" w:w="1200"/>
@@ -8429,10 +8694,12 @@
           <w:p>
             <w:pPr>
               <w:bidi w:val="0"/>
-              <w:jc w:val="start"/>
+              <w:jc w:val="left"/>
               <w:keepNext/>
               <w:keepLines/>
+              <w:outlineLvl w:val="1"/>
             </w:pPr>
+            <w:bookmarkStart w:id="4" w:name="cluster_node_telemetry_8886505f"/>
             <w:r>
               <w:rPr>
                 <w:rFonts w:ascii="Segoe UI" w:hAnsi="Segoe UI" w:cs="Vazirmatn"/>
@@ -8444,8 +8711,59 @@
                 <w:lang w:val="en-US" w:bidi="fa-IR"/>
                 <w:rtl w:val="0"/>
               </w:rPr>
-              <w:t>Cluster Node Telemetry</w:t>
-            </w:r>
+              <w:t>Cluster</w:t>
+            </w:r>
+            <w:r>
+              <w:rPr>
+                <w:rFonts w:ascii="Vazirmatn" w:hAnsi="Vazirmatn" w:cs="Vazirmatn"/>
+                <w:sz w:val="28"/>
+                <w:szCs w:val="28"/>
+                <w:b/>
+                <w:bCs/>
+                <w:color w:val="2D2D2D"/>
+                <w:lang w:val="en-US" w:bidi="fa-IR"/>
+              </w:rPr>
+              <w:t xml:space="preserve"> </w:t>
+            </w:r>
+            <w:r>
+              <w:rPr>
+                <w:rFonts w:ascii="Segoe UI" w:hAnsi="Segoe UI" w:cs="Vazirmatn"/>
+                <w:sz w:val="28"/>
+                <w:szCs w:val="28"/>
+                <w:b/>
+                <w:bCs/>
+                <w:color w:val="2D2D2D"/>
+                <w:lang w:val="en-US" w:bidi="fa-IR"/>
+                <w:rtl w:val="0"/>
+              </w:rPr>
+              <w:t>Node</w:t>
+            </w:r>
+            <w:r>
+              <w:rPr>
+                <w:rFonts w:ascii="Vazirmatn" w:hAnsi="Vazirmatn" w:cs="Vazirmatn"/>
+                <w:sz w:val="28"/>
+                <w:szCs w:val="28"/>
+                <w:b/>
+                <w:bCs/>
+                <w:color w:val="2D2D2D"/>
+                <w:lang w:val="en-US" w:bidi="fa-IR"/>
+              </w:rPr>
+              <w:t xml:space="preserve"> </w:t>
+            </w:r>
+            <w:r>
+              <w:rPr>
+                <w:rFonts w:ascii="Segoe UI" w:hAnsi="Segoe UI" w:cs="Vazirmatn"/>
+                <w:sz w:val="28"/>
+                <w:szCs w:val="28"/>
+                <w:b/>
+                <w:bCs/>
+                <w:color w:val="2D2D2D"/>
+                <w:lang w:val="en-US" w:bidi="fa-IR"/>
+                <w:rtl w:val="0"/>
+              </w:rPr>
+              <w:t>Telemetry</w:t>
+            </w:r>
+            <w:bookmarkEnd w:id="4"/>
           </w:p>
         </w:tc>
       </w:tr>
@@ -9053,6 +9371,7 @@
         <w:tblW w:type="dxa" w:w="9638"/>
         <w:tblLayout w:type="fixed"/>
         <w:tblLook w:firstColumn="1" w:firstRow="1" w:lastColumn="0" w:lastRow="0" w:noHBand="0" w:noVBand="1" w:val="04A0"/>
+        <w:tblDescription w:val="code_block"/>
         <w:jc w:val="center"/>
       </w:tblPr>
       <w:tblGrid>
@@ -9838,15 +10157,19 @@
         <w:tblW w:type="dxa" w:w="9638"/>
         <w:tblLayout w:type="fixed"/>
         <w:tblLook w:firstColumn="1" w:firstRow="1" w:lastColumn="0" w:lastRow="0" w:noHBand="0" w:noVBand="1" w:val="04A0"/>
+        <w:tblDescription w:val="heading_badge"/>
       </w:tblPr>
       <w:tblGrid>
-        <w:gridCol w:w="1216"/>
-        <w:gridCol w:w="8422"/>
+        <w:gridCol w:w="1296"/>
+        <w:gridCol w:w="8342"/>
       </w:tblGrid>
       <w:tr>
+        <w:trPr>
+          <w:cantSplit/>
+        </w:trPr>
         <w:tc>
           <w:tcPr>
-            <w:tcW w:type="dxa" w:w="1216"/>
+            <w:tcW w:type="dxa" w:w="1296"/>
             <w:shd w:val="clear" w:color="auto" w:fill="6B2FA0"/>
             <w:tcMar>
               <w:top w:w="80" w:type="dxa"/>
@@ -9884,7 +10207,7 @@
         </w:tc>
         <w:tc>
           <w:tcPr>
-            <w:tcW w:type="dxa" w:w="8422"/>
+            <w:tcW w:type="dxa" w:w="8342"/>
             <w:tcMar>
               <w:top w:w="80" w:type="dxa"/>
               <w:bottom w:w="80" w:type="dxa"/>
@@ -9901,10 +10224,12 @@
           <w:p>
             <w:pPr>
               <w:bidi w:val="0"/>
-              <w:jc w:val="start"/>
+              <w:jc w:val="left"/>
               <w:keepNext/>
               <w:keepLines/>
+              <w:outlineLvl w:val="2"/>
             </w:pPr>
+            <w:bookmarkStart w:id="5" w:name="cluster_node_status_matrix_e2c1052e"/>
             <w:r>
               <w:rPr>
                 <w:rFonts w:ascii="Segoe UI" w:hAnsi="Segoe UI" w:cs="Vazirmatn"/>
@@ -9916,8 +10241,84 @@
                 <w:lang w:val="en-US" w:bidi="fa-IR"/>
                 <w:rtl w:val="0"/>
               </w:rPr>
-              <w:t>Cluster Node Status Matrix</w:t>
-            </w:r>
+              <w:t>Cluster</w:t>
+            </w:r>
+            <w:r>
+              <w:rPr>
+                <w:rFonts w:ascii="Vazirmatn" w:hAnsi="Vazirmatn" w:cs="Vazirmatn"/>
+                <w:sz w:val="26"/>
+                <w:szCs w:val="26"/>
+                <w:b/>
+                <w:bCs/>
+                <w:color w:val="2D2D2D"/>
+                <w:lang w:val="en-US" w:bidi="fa-IR"/>
+              </w:rPr>
+              <w:t xml:space="preserve"> </w:t>
+            </w:r>
+            <w:r>
+              <w:rPr>
+                <w:rFonts w:ascii="Segoe UI" w:hAnsi="Segoe UI" w:cs="Vazirmatn"/>
+                <w:sz w:val="26"/>
+                <w:szCs w:val="26"/>
+                <w:b/>
+                <w:bCs/>
+                <w:color w:val="2D2D2D"/>
+                <w:lang w:val="en-US" w:bidi="fa-IR"/>
+                <w:rtl w:val="0"/>
+              </w:rPr>
+              <w:t>Node</w:t>
+            </w:r>
+            <w:r>
+              <w:rPr>
+                <w:rFonts w:ascii="Vazirmatn" w:hAnsi="Vazirmatn" w:cs="Vazirmatn"/>
+                <w:sz w:val="26"/>
+                <w:szCs w:val="26"/>
+                <w:b/>
+                <w:bCs/>
+                <w:color w:val="2D2D2D"/>
+                <w:lang w:val="en-US" w:bidi="fa-IR"/>
+              </w:rPr>
+              <w:t xml:space="preserve"> </w:t>
+            </w:r>
+            <w:r>
+              <w:rPr>
+                <w:rFonts w:ascii="Segoe UI" w:hAnsi="Segoe UI" w:cs="Vazirmatn"/>
+                <w:sz w:val="26"/>
+                <w:szCs w:val="26"/>
+                <w:b/>
+                <w:bCs/>
+                <w:color w:val="2D2D2D"/>
+                <w:lang w:val="en-US" w:bidi="fa-IR"/>
+                <w:rtl w:val="0"/>
+              </w:rPr>
+              <w:t>Status</w:t>
+            </w:r>
+            <w:r>
+              <w:rPr>
+                <w:rFonts w:ascii="Vazirmatn" w:hAnsi="Vazirmatn" w:cs="Vazirmatn"/>
+                <w:sz w:val="26"/>
+                <w:szCs w:val="26"/>
+                <w:b/>
+                <w:bCs/>
+                <w:color w:val="2D2D2D"/>
+                <w:lang w:val="en-US" w:bidi="fa-IR"/>
+              </w:rPr>
+              <w:t xml:space="preserve"> </w:t>
+            </w:r>
+            <w:r>
+              <w:rPr>
+                <w:rFonts w:ascii="Segoe UI" w:hAnsi="Segoe UI" w:cs="Vazirmatn"/>
+                <w:sz w:val="26"/>
+                <w:szCs w:val="26"/>
+                <w:b/>
+                <w:bCs/>
+                <w:color w:val="2D2D2D"/>
+                <w:lang w:val="en-US" w:bidi="fa-IR"/>
+                <w:rtl w:val="0"/>
+              </w:rPr>
+              <w:t>Matrix</w:t>
+            </w:r>
+            <w:bookmarkEnd w:id="5"/>
           </w:p>
         </w:tc>
       </w:tr>
@@ -10192,6 +10593,7 @@
         <w:tblW w:type="dxa" w:w="9638"/>
         <w:tblLayout w:type="fixed"/>
         <w:tblLook w:firstColumn="1" w:firstRow="1" w:lastColumn="0" w:lastRow="0" w:noHBand="0" w:noVBand="1" w:val="04A0"/>
+        <w:tblDescription w:val="data_table"/>
       </w:tblPr>
       <w:tblGrid>
         <w:gridCol w:w="1606"/>
@@ -10203,8 +10605,8 @@
       </w:tblGrid>
       <w:tr>
         <w:trPr>
+          <w:tblHeader/>
           <w:cantSplit/>
-          <w:tblHeader/>
         </w:trPr>
         <w:tc>
           <w:tcPr>
@@ -10536,9 +10938,6 @@
         </w:tc>
       </w:tr>
       <w:tr>
-        <w:trPr>
-          <w:cantSplit/>
-        </w:trPr>
         <w:tc>
           <w:tcPr>
             <w:tcW w:type="dxa" w:w="1606"/>
@@ -10818,9 +11217,6 @@
         </w:tc>
       </w:tr>
       <w:tr>
-        <w:trPr>
-          <w:cantSplit/>
-        </w:trPr>
         <w:tc>
           <w:tcPr>
             <w:tcW w:type="dxa" w:w="1606"/>
@@ -11141,9 +11537,6 @@
         </w:tc>
       </w:tr>
       <w:tr>
-        <w:trPr>
-          <w:cantSplit/>
-        </w:trPr>
         <w:tc>
           <w:tcPr>
             <w:tcW w:type="dxa" w:w="1606"/>
@@ -11464,9 +11857,6 @@
         </w:tc>
       </w:tr>
       <w:tr>
-        <w:trPr>
-          <w:cantSplit/>
-        </w:trPr>
         <w:tc>
           <w:tcPr>
             <w:tcW w:type="dxa" w:w="1606"/>
@@ -11757,12 +12147,16 @@
         <w:tblW w:type="dxa" w:w="9638"/>
         <w:tblLayout w:type="fixed"/>
         <w:tblLook w:firstColumn="1" w:firstRow="1" w:lastColumn="0" w:lastRow="0" w:noHBand="0" w:noVBand="1" w:val="04A0"/>
+        <w:tblDescription w:val="heading_badge"/>
       </w:tblPr>
       <w:tblGrid>
         <w:gridCol w:w="1200"/>
         <w:gridCol w:w="8438"/>
       </w:tblGrid>
       <w:tr>
+        <w:trPr>
+          <w:cantSplit/>
+        </w:trPr>
         <w:tc>
           <w:tcPr>
             <w:tcW w:type="dxa" w:w="1200"/>
@@ -11820,10 +12214,12 @@
           <w:p>
             <w:pPr>
               <w:bidi w:val="0"/>
-              <w:jc w:val="start"/>
+              <w:jc w:val="left"/>
               <w:keepNext/>
               <w:keepLines/>
+              <w:outlineLvl w:val="1"/>
             </w:pPr>
+            <w:bookmarkStart w:id="6" w:name="maintenance_and_backup_procedur_1d70b75a"/>
             <w:r>
               <w:rPr>
                 <w:rFonts w:ascii="Segoe UI" w:hAnsi="Segoe UI" w:cs="Vazirmatn"/>
@@ -11835,8 +12231,84 @@
                 <w:lang w:val="en-US" w:bidi="fa-IR"/>
                 <w:rtl w:val="0"/>
               </w:rPr>
-              <w:t>Maintenance and Backup Procedures</w:t>
-            </w:r>
+              <w:t>Maintenance</w:t>
+            </w:r>
+            <w:r>
+              <w:rPr>
+                <w:rFonts w:ascii="Vazirmatn" w:hAnsi="Vazirmatn" w:cs="Vazirmatn"/>
+                <w:sz w:val="28"/>
+                <w:szCs w:val="28"/>
+                <w:b/>
+                <w:bCs/>
+                <w:color w:val="2D2D2D"/>
+                <w:lang w:val="en-US" w:bidi="fa-IR"/>
+              </w:rPr>
+              <w:t xml:space="preserve"> </w:t>
+            </w:r>
+            <w:r>
+              <w:rPr>
+                <w:rFonts w:ascii="Segoe UI" w:hAnsi="Segoe UI" w:cs="Vazirmatn"/>
+                <w:sz w:val="28"/>
+                <w:szCs w:val="28"/>
+                <w:b/>
+                <w:bCs/>
+                <w:color w:val="2D2D2D"/>
+                <w:lang w:val="en-US" w:bidi="fa-IR"/>
+                <w:rtl w:val="0"/>
+              </w:rPr>
+              <w:t>and</w:t>
+            </w:r>
+            <w:r>
+              <w:rPr>
+                <w:rFonts w:ascii="Vazirmatn" w:hAnsi="Vazirmatn" w:cs="Vazirmatn"/>
+                <w:sz w:val="28"/>
+                <w:szCs w:val="28"/>
+                <w:b/>
+                <w:bCs/>
+                <w:color w:val="2D2D2D"/>
+                <w:lang w:val="en-US" w:bidi="fa-IR"/>
+              </w:rPr>
+              <w:t xml:space="preserve"> </w:t>
+            </w:r>
+            <w:r>
+              <w:rPr>
+                <w:rFonts w:ascii="Segoe UI" w:hAnsi="Segoe UI" w:cs="Vazirmatn"/>
+                <w:sz w:val="28"/>
+                <w:szCs w:val="28"/>
+                <w:b/>
+                <w:bCs/>
+                <w:color w:val="2D2D2D"/>
+                <w:lang w:val="en-US" w:bidi="fa-IR"/>
+                <w:rtl w:val="0"/>
+              </w:rPr>
+              <w:t>Backup</w:t>
+            </w:r>
+            <w:r>
+              <w:rPr>
+                <w:rFonts w:ascii="Vazirmatn" w:hAnsi="Vazirmatn" w:cs="Vazirmatn"/>
+                <w:sz w:val="28"/>
+                <w:szCs w:val="28"/>
+                <w:b/>
+                <w:bCs/>
+                <w:color w:val="2D2D2D"/>
+                <w:lang w:val="en-US" w:bidi="fa-IR"/>
+              </w:rPr>
+              <w:t xml:space="preserve"> </w:t>
+            </w:r>
+            <w:r>
+              <w:rPr>
+                <w:rFonts w:ascii="Segoe UI" w:hAnsi="Segoe UI" w:cs="Vazirmatn"/>
+                <w:sz w:val="28"/>
+                <w:szCs w:val="28"/>
+                <w:b/>
+                <w:bCs/>
+                <w:color w:val="2D2D2D"/>
+                <w:lang w:val="en-US" w:bidi="fa-IR"/>
+                <w:rtl w:val="0"/>
+              </w:rPr>
+              <w:t>Procedures</w:t>
+            </w:r>
+            <w:bookmarkEnd w:id="6"/>
           </w:p>
         </w:tc>
       </w:tr>
@@ -12478,19 +12950,6 @@
       <w:docGrid w:linePitch="360"/>
       <w:bidi w:val="1"/>
     </w:sectPr>
-    <w:bookmarkStart w:id="23772" w:name="distributed-cache-and-persistence-archit"/>
-    <w:bookmarkEnd w:id="23772">
-      <w:bookmarkStart w:id="10778" w:name="cache-aside-pattern-and-invalidation"/>
-      <w:bookmarkEnd w:id="10778"/>
-      <w:bookmarkStart w:id="91085" w:name="data-access-implementation"/>
-      <w:bookmarkEnd w:id="91085"/>
-      <w:bookmarkStart w:id="28463" w:name="cluster-node-telemetry"/>
-      <w:bookmarkEnd w:id="28463"/>
-      <w:bookmarkStart w:id="18695" w:name="cluster-node-status-matrix"/>
-      <w:bookmarkEnd w:id="18695"/>
-      <w:bookmarkStart w:id="31723" w:name="maintenance-and-backup-procedures"/>
-      <w:bookmarkEnd w:id="31723"/>
-    </w:bookmarkEnd>
   </w:body>
 </w:document>
 </file>

</xml_diff>